<commit_message>
ajustement pour le déploiement
</commit_message>
<xml_diff>
--- a/task-api rendu.docx
+++ b/task-api rendu.docx
@@ -62,8 +62,13 @@
         </w:numPr>
       </w:pPr>
       <w:r>
-        <w:t>Lyse Libelo</w:t>
-      </w:r>
+        <w:t xml:space="preserve">Lice </w:t>
+      </w:r>
+      <w:proofErr w:type="spellStart"/>
+      <w:r>
+        <w:t>Loubelo</w:t>
+      </w:r>
+      <w:proofErr w:type="spellEnd"/>
     </w:p>
     <w:p>
       <w:pPr>
@@ -86,7 +91,7 @@
         </w:numPr>
       </w:pPr>
       <w:r>
-        <w:t>Ivan Darel</w:t>
+        <w:t>Yvon Darel</w:t>
       </w:r>
     </w:p>
     <w:p>
@@ -97,8 +102,13 @@
           <w:numId w:val="1"/>
         </w:numPr>
       </w:pPr>
-      <w:r>
-        <w:t>Chris Sache Saint Nguala</w:t>
+      <w:proofErr w:type="spellStart"/>
+      <w:r>
+        <w:t>Ngouala</w:t>
+      </w:r>
+      <w:proofErr w:type="spellEnd"/>
+      <w:r>
+        <w:t xml:space="preserve"> Sach Christ saint</w:t>
       </w:r>
     </w:p>
     <w:p>
@@ -1302,6 +1312,18 @@
       <w:shd w:val="clear" w:color="auto" w:fill="E1DFDD"/>
     </w:rPr>
   </w:style>
+  <w:style w:type="character" w:styleId="Lienhypertextesuivivisit">
+    <w:name w:val="FollowedHyperlink"/>
+    <w:basedOn w:val="Policepardfaut"/>
+    <w:uiPriority w:val="99"/>
+    <w:semiHidden/>
+    <w:unhideWhenUsed/>
+    <w:rsid w:val="005A1C60"/>
+    <w:rPr>
+      <w:color w:val="954F72" w:themeColor="followedHyperlink"/>
+      <w:u w:val="single"/>
+    </w:rPr>
+  </w:style>
 </w:styles>
 </file>
 

</xml_diff>